<commit_message>
Correct the screenshot provenance on five labs
Labs 4, 6, 12, 14 and 15 are GKE labs whose banners said 'Tested end-to-end on
a real GKE cluster. Every screenshot is a real capture.' The captures added
this week for the steps that were missing them were taken on kind, not GKE, so
that sentence implied a provenance the images no longer had.

Each banner now names which steps were captured where, and on what date. The
images were always real; the claim about where they came from was not.

Labs 11 and 13 already named both clusters before that sentence and are
unchanged.

Co-Authored-By: Claude Opus 5 <noreply@anthropic.com>
</commit_message>
<xml_diff>
--- a/additional/optional-day-control-plane-and-war-room/lab-06-operators-finalizers.docx
+++ b/additional/optional-day-control-plane-and-war-room/lab-06-operators-finalizers.docx
@@ -94,7 +94,52 @@
         <w:t xml:space="preserve">dcproject-462806</w:t>
       </w:r>
       <w:r>
-        <w:t xml:space="preserve">, the shared Day-2 cluster). Every screenshot is a real capture. The eye-opener:</w:t>
+        <w:t xml:space="preserve">, the shared Day-2 cluster). Screenshots for Steps 1–3 are real captures from that GKE cluster;</w:t>
+      </w:r>
+      <w:r>
+        <w:t xml:space="preserve"> </w:t>
+      </w:r>
+      <w:r>
+        <w:rPr>
+          <w:b/>
+          <w:bCs/>
+        </w:rPr>
+        <w:t xml:space="preserve">Step 4's two captures were taken on a local</w:t>
+      </w:r>
+      <w:r>
+        <w:rPr>
+          <w:b/>
+          <w:bCs/>
+        </w:rPr>
+        <w:t xml:space="preserve"> </w:t>
+      </w:r>
+      <w:r>
+        <w:rPr>
+          <w:rStyle w:val="VerbatimChar"/>
+          <w:b/>
+          <w:bCs/>
+        </w:rPr>
+        <w:t xml:space="preserve">kind</w:t>
+      </w:r>
+      <w:r>
+        <w:rPr>
+          <w:b/>
+          <w:bCs/>
+        </w:rPr>
+        <w:t xml:space="preserve"> </w:t>
+      </w:r>
+      <w:r>
+        <w:rPr>
+          <w:b/>
+          <w:bCs/>
+        </w:rPr>
+        <w:t xml:space="preserve">cluster on 2026-09-28</w:t>
+      </w:r>
+      <w:r>
+        <w:t xml:space="preserve"> </w:t>
+      </w:r>
+      <w:r>
+        <w:t xml:space="preserve">— see the note in that step about how kind's metrics pipeline changes one HPA condition. The eye-opener:</w:t>
       </w:r>
       <w:r>
         <w:t xml:space="preserve"> </w:t>

</xml_diff>